<commit_message>
Corrección: Sincronización de nombres de proveedores en historial y modal de edición
</commit_message>
<xml_diff>
--- a/app/static/plantillas/01 ESTUDIOS PREVIOS.docx
+++ b/app/static/plantillas/01 ESTUDIOS PREVIOS.docx
@@ -4,6 +4,7 @@
   <w:body>
     <w:p>
       <w:pPr>
+        <w:ind w:left="1416" w:hanging="708"/>
         <w:rPr>
           <w:u w:val="single"/>
         </w:rPr>
@@ -3951,7 +3952,7 @@
                 <w:b/>
                 <w:spacing w:val="-2"/>
               </w:rPr>
-              <w:t xml:space="preserve">$ </w:t>
+              <w:t xml:space="preserve"> </w:t>
             </w:r>
             <w:proofErr w:type="gramStart"/>
             <w:r>
@@ -5636,11 +5637,7 @@
         <w:t xml:space="preserve"> </w:t>
       </w:r>
       <w:r>
-        <w:t xml:space="preserve">con el </w:t>
-      </w:r>
-      <w:r>
-        <w:lastRenderedPageBreak/>
-        <w:t>fin de proceder al pago correspondiente.</w:t>
+        <w:t>con el fin de proceder al pago correspondiente.</w:t>
       </w:r>
     </w:p>
     <w:p>
@@ -5658,6 +5655,7 @@
         <w:jc w:val="both"/>
       </w:pPr>
       <w:r>
+        <w:lastRenderedPageBreak/>
         <w:t xml:space="preserve">Impulsar el trámite de los pagos a favor del contratista en los términos establecidos para tales </w:t>
       </w:r>
       <w:r>
@@ -7253,11 +7251,7 @@
         <w:t xml:space="preserve"> </w:t>
       </w:r>
       <w:r>
-        <w:t xml:space="preserve">de riesgos que afecten el cabal ejecución del contrato y la permanencia de la ecuación contractual </w:t>
-      </w:r>
-      <w:r>
-        <w:lastRenderedPageBreak/>
-        <w:t xml:space="preserve">durante toda la vigencia del contrato, y en tal evento, serán de su cargo y responsabilidad los costos </w:t>
+        <w:t xml:space="preserve">de riesgos que afecten el cabal ejecución del contrato y la permanencia de la ecuación contractual durante toda la vigencia del contrato, y en tal evento, serán de su cargo y responsabilidad los costos </w:t>
       </w:r>
     </w:p>
     <w:p>
@@ -7312,7 +7306,11 @@
       </w:r>
       <w:proofErr w:type="gramEnd"/>
       <w:r>
-        <w:t xml:space="preserve"> todas         aquellas donde el contratista demuestre que no tuvo responsabilidad.</w:t>
+        <w:t xml:space="preserve"> todas         </w:t>
+      </w:r>
+      <w:r>
+        <w:lastRenderedPageBreak/>
+        <w:t>aquellas donde el contratista demuestre que no tuvo responsabilidad.</w:t>
       </w:r>
     </w:p>
     <w:p>

</xml_diff>